<commit_message>
Update final ESG report analysis and audit documentation for accuracy and clarity
</commit_message>
<xml_diff>
--- a/results/Actual vs Generatet/Together/Final_ESG_Report_Analysis.docx
+++ b/results/Actual vs Generatet/Together/Final_ESG_Report_Analysis.docx
@@ -3948,6 +3948,32 @@
         <w:pStyle w:val="Heading1"/>
       </w:pPr>
       <w:r>
+        <w:t>Conclusion</w:t>
+      </w:r>
+    </w:p>
+    <w:p>
+      <w:pPr/>
+      <w:r>
+        <w:t>The overall conclusion is that the DataNXT and ChatGPT-based workflow is effective for creating comparable ESG summaries across companies, but it should be understood as an AI-assisted drafting and analysis workflow rather than a replacement for official ESG disclosure. The generated reports reproduce the main ESG categories and provide a clear cross-company structure, while the actual benchmark reports remain substantially stronger in disclosure depth, quantitative evidence, reporting-boundary detail, assurance language, and framework-specific terminology.</w:t>
+      </w:r>
+    </w:p>
+    <w:p>
+      <w:pPr/>
+      <w:r>
+        <w:t>The Python analysis supports this interpretation: generated reports show only modest similarity to the official benchmarks, are much shorter than the actual reports, and often concentrate ESG vocabulary more densely because they are structured summaries. The qualitative analysis leads to the same conclusion. The main weakness is not systematic factual contradiction, but missing granularity, fewer auditable figures, weaker materiality framing, and less detailed treatment of risks, controversies, target conflicts, and company-specific reporting boundaries.</w:t>
+      </w:r>
+    </w:p>
+    <w:p>
+      <w:pPr/>
+      <w:r>
+        <w:t>For the case study, this means that the workflow is useful for preparing consistent first drafts, comparing ESG communication patterns, and identifying gaps between generated and official reporting. However, any final ESG assessment should still be validated against official company disclosures and reviewed critically by a human analyst.</w:t>
+      </w:r>
+    </w:p>
+    <w:p>
+      <w:pPr>
+        <w:pStyle w:val="Heading1"/>
+      </w:pPr>
+      <w:r>
         <w:t>Source Note</w:t>
       </w:r>
     </w:p>

</xml_diff>